<commit_message>
Fold RCEES faculty-page thesis, service, and NSFC titles
Add the Hokkaido thesis title, inquiry fields, professional service,
and two hosted NSFC project titles from the faculty page. Keep awards
empty. List 任西婵 et al. 2022 under Energy & Biodiversity with the
环境保护科学 citation (no Crossref DOI). Projects stay on the CV, not
the homepage.

Co-authored-by: yikunpeng82 <yikunpeng82@gmail.com>
</commit_message>
<xml_diff>
--- a/public/cv/kunpeng-yi-cv-en.docx
+++ b/public/cv/kunpeng-yi-cv-en.docx
@@ -70,7 +70,7 @@
         <w:pStyle w:val="ListBullet"/>
       </w:pPr>
       <w:r>
-        <w:t>Ph.D., Remote Sensing, Hokkaido University — October 2010 – June 2014</w:t>
+        <w:t>Ph.D., Remote Sensing, Hokkaido University — October 2010 – June 2014. Thesis: 遥感卫星观测及模型在生物质火烧中的应用研究</w:t>
       </w:r>
     </w:p>
     <w:p>
@@ -101,7 +101,53 @@
     </w:p>
     <w:p>
       <w:r>
+        <w:t>Faculty-page research direction: 生态环境遥感研究.</w:t>
+      </w:r>
+    </w:p>
+    <w:p>
+      <w:r>
         <w:t>Research addresses global climate change and eco-environmental remote sensing. Typical ecosystems—wetlands, forests and grasslands—in cities, nature reserves and national parks are examined in relation to drought, flood, wildfire and other extreme meteorological hazards. Threatened migratory birds are treated as indicator species for migration mechanisms, flyway-corridor conservation, and responses to human activity and extreme climate events. Applications include Sino BON, restoration of typical degraded wetlands in Northeast China, bird-habitat planning for the Xiong'an New Area, Nanchang territorial spatial planning (2019–2035), and a bird-strike risk early-warning system. Public academic identity is positioned as Movement Ecology × Earth Observation × Biodiversity Conservation.</w:t>
+      </w:r>
+    </w:p>
+    <w:p>
+      <w:r>
+        <w:rPr>
+          <w:b/>
+          <w:color w:val="0B1F33"/>
+          <w:sz w:val="26"/>
+        </w:rPr>
+        <w:t>Professional service</w:t>
+      </w:r>
+    </w:p>
+    <w:p>
+      <w:r>
+        <w:t>China Grassland Society (council member). Member of the Geographical Society of China, the Ecological Society of China, the Chinese Society of Remote Sensing, and the China Ornithological Society. Guest-in-chief editor of special issues for Remote Sensing, Land and Fire. The RCEES faculty-page awards section is empty.</w:t>
+      </w:r>
+    </w:p>
+    <w:p>
+      <w:r>
+        <w:rPr>
+          <w:b/>
+          <w:color w:val="0B1F33"/>
+          <w:sz w:val="26"/>
+        </w:rPr>
+        <w:t>Hosted NSFC projects (faculty page)</w:t>
+      </w:r>
+    </w:p>
+    <w:p>
+      <w:pPr>
+        <w:pStyle w:val="ListBullet"/>
+      </w:pPr>
+      <w:r>
+        <w:t>鸟类多尺度运动行为模式及其迁徙路线核心栖息地监测与保护研究. NSFC General Programme, 2023.01–2026.12, 主持</w:t>
+      </w:r>
+    </w:p>
+    <w:p>
+      <w:pPr>
+        <w:pStyle w:val="ListBullet"/>
+      </w:pPr>
+      <w:r>
+        <w:t>基于多源遥感和卫星追踪大数据的鸟类运动行为信息反演研究. NSFC General Programme, 2019.01–2022.12, 主持</w:t>
       </w:r>
     </w:p>
     <w:p>
@@ -196,6 +242,14 @@
       </w:pPr>
       <w:r>
         <w:t>Bao, Y., Shinoda, M., Yi, K., et al. (2022). Satellite-Based Analysis of Spatiotemporal Wildfire Pattern in the Mongolian Plateau. Remote Sensing 15(1): 190. doi:10.3390/rs15010190</w:t>
+      </w:r>
+    </w:p>
+    <w:p>
+      <w:pPr>
+        <w:pStyle w:val="ListBullet"/>
+      </w:pPr>
+      <w:r>
+        <w:t>Ren, X., Yi, K. &amp; Cao, L. (2022). 优化风电场和电网布局以避免鸟撞. 环境保护科学 48(3): 13–19. Listed on the official RCEES laboratory profile; no Crossref DOI verified.</w:t>
       </w:r>
     </w:p>
     <w:p>

</xml_diff>

<commit_message>
Production content pass: visitor voice, six-section home, Academic CV/Bio
Strip backstage copy from visitor pages, rebuild Academic CV (4 pp) and Academic Bio (1 pp) in EN/ZH, use SKLRUE lab wording, and present five selected papers once on the home page.

Co-authored-by: yikunpeng82-sys <yikunpeng82-sys@users.noreply.github.com>
</commit_message>
<xml_diff>
--- a/public/cv/kunpeng-yi-cv-en.docx
+++ b/public/cv/kunpeng-yi-cv-en.docx
@@ -3,15 +3,27 @@
 <w:document xmlns:wpc="http://schemas.microsoft.com/office/word/2010/wordprocessingCanvas" xmlns:mo="http://schemas.microsoft.com/office/mac/office/2008/main" xmlns:mc="http://schemas.openxmlformats.org/markup-compatibility/2006" xmlns:mv="urn:schemas-microsoft-com:mac:vml" xmlns:o="urn:schemas-microsoft-com:office:office" xmlns:r="http://schemas.openxmlformats.org/officeDocument/2006/relationships" xmlns:m="http://schemas.openxmlformats.org/officeDocument/2006/math" xmlns:v="urn:schemas-microsoft-com:vml" xmlns:wp14="http://schemas.microsoft.com/office/word/2010/wordprocessingDrawing" xmlns:wp="http://schemas.openxmlformats.org/drawingml/2006/wordprocessingDrawing" xmlns:w10="urn:schemas-microsoft-com:office:word" xmlns:w="http://schemas.openxmlformats.org/wordprocessingml/2006/main" xmlns:w14="http://schemas.microsoft.com/office/word/2010/wordml" xmlns:wpg="http://schemas.microsoft.com/office/word/2010/wordprocessingGroup" xmlns:wpi="http://schemas.microsoft.com/office/word/2010/wordprocessingInk" xmlns:wne="http://schemas.microsoft.com/office/word/2006/wordml" xmlns:wps="http://schemas.microsoft.com/office/word/2010/wordprocessingShape" mc:Ignorable="w14 wp14">
   <w:body>
     <w:p>
-      <w:pPr>
-        <w:jc w:val="left"/>
-      </w:pPr>
       <w:r>
         <w:rPr>
           <w:b/>
           <w:sz w:val="36"/>
         </w:rPr>
-        <w:t>Curriculum Vitae — Kunpeng Yi / 伊坤朋</w:t>
+        <w:t>Academic CV — Kunpeng Yi / 伊坤朋</w:t>
+      </w:r>
+    </w:p>
+    <w:p>
+      <w:r>
+        <w:t>Associate Professor, Research Center for Eco-Environmental Sciences, Chinese Academy of Sciences</w:t>
+      </w:r>
+    </w:p>
+    <w:p>
+      <w:r>
+        <w:t>State Key Laboratory of Regional and Urban Ecology (SKLRUE)</w:t>
+      </w:r>
+    </w:p>
+    <w:p>
+      <w:r>
+        <w:t>Email: kpyi@rcees.ac.cn · Office: 010-62915655 · 18 Shuangqing Road, Haidian District, Beijing 100085 · https://dse.rcees.cas.cn/ · https://yikunpeng82-sys.github.io/kunpeng-yi-website/</w:t>
       </w:r>
     </w:p>
     <w:p>
@@ -21,32 +33,7 @@
           <w:color w:val="0B1F33"/>
           <w:sz w:val="26"/>
         </w:rPr>
-        <w:t>Personal Information</w:t>
-      </w:r>
-    </w:p>
-    <w:p>
-      <w:r>
-        <w:t>Name: Kunpeng Yi</w:t>
-      </w:r>
-    </w:p>
-    <w:p>
-      <w:r>
-        <w:t>Degree: Ph.D.</w:t>
-      </w:r>
-    </w:p>
-    <w:p>
-      <w:r>
-        <w:t>Position: Associate Professor, Research Center for Eco-Environmental Sciences, Chinese Academy of Sciences</w:t>
-      </w:r>
-    </w:p>
-    <w:p>
-      <w:r>
-        <w:rPr>
-          <w:b/>
-          <w:color w:val="0B1F33"/>
-          <w:sz w:val="26"/>
-        </w:rPr>
-        <w:t>Education &amp; Appointments</w:t>
+        <w:t>Education and appointments</w:t>
       </w:r>
     </w:p>
     <w:p>
@@ -54,7 +41,7 @@
         <w:pStyle w:val="ListBullet"/>
       </w:pPr>
       <w:r>
-        <w:t>Associate Researcher / Associate Professor, Research Center for Eco-Environmental Sciences, Chinese Academy of Sciences &amp; Key Laboratory of Urban and Regional Ecology — April 2017 – present</w:t>
+        <w:t>Associate Professor, Research Center for Eco-Environmental Sciences, Chinese Academy of Sciences; State Key Laboratory of Regional and Urban Ecology (SKLRUE), formerly State Key Laboratory of Urban and Regional Ecology — April 2017 – present</w:t>
       </w:r>
     </w:p>
     <w:p>
@@ -62,7 +49,7 @@
         <w:pStyle w:val="ListBullet"/>
       </w:pPr>
       <w:r>
-        <w:t>Postdoctoral Fellow (Ecological Remote Sensing), Institute of Space and Earth Information Innovation, Chinese Academy of Sciences (Aerospace Information Research Institute / former RADI) — August 2014 – April 2017</w:t>
+        <w:t>Postdoctoral Fellow (Ecological Remote Sensing), Aerospace Information Research Institute, Chinese Academy of Sciences (AIRCAS), formerly RADI — August 2014 – April 2017</w:t>
       </w:r>
     </w:p>
     <w:p>
@@ -96,17 +83,297 @@
           <w:color w:val="0B1F33"/>
           <w:sz w:val="26"/>
         </w:rPr>
-        <w:t>Research interests</w:t>
+        <w:t>Research</w:t>
       </w:r>
     </w:p>
     <w:p>
       <w:r>
-        <w:t>Faculty-page research direction: 生态环境遥感研究.</w:t>
+        <w:t>Research addresses global climate change and eco-environmental remote sensing. Typical ecosystems—wetlands, forests and grasslands—in cities, nature reserves and national parks are examined in relation to drought, flood, wildfire and other extreme meteorological hazards. Threatened migratory birds are treated as indicator species for migration mechanisms, flyway-corridor conservation, and responses to human activity and extreme climate events. Applications include Sino BON, restoration of typical degraded wetlands in Northeast China, bird-habitat planning for the Xiong'an New Area, Nanchang territorial spatial planning (2019–2035), and a bird-strike risk early-warning system. Public academic identity: Movement Ecology × Earth Observation × Biodiversity Conservation.</w:t>
       </w:r>
     </w:p>
     <w:p>
       <w:r>
-        <w:t>Research addresses global climate change and eco-environmental remote sensing. Typical ecosystems—wetlands, forests and grasslands—in cities, nature reserves and national parks are examined in relation to drought, flood, wildfire and other extreme meteorological hazards. Threatened migratory birds are treated as indicator species for migration mechanisms, flyway-corridor conservation, and responses to human activity and extreme climate events. Applications include Sino BON, restoration of typical degraded wetlands in Northeast China, bird-habitat planning for the Xiong'an New Area, Nanchang territorial spatial planning (2019–2035), and a bird-strike risk early-warning system. Public academic identity is positioned as Movement Ecology × Earth Observation × Biodiversity Conservation.</w:t>
+        <w:rPr>
+          <w:b/>
+          <w:color w:val="0B1F33"/>
+          <w:sz w:val="26"/>
+        </w:rPr>
+        <w:t>Hosted projects</w:t>
+      </w:r>
+    </w:p>
+    <w:p>
+      <w:pPr>
+        <w:pStyle w:val="ListBullet"/>
+      </w:pPr>
+      <w:r>
+        <w:t>鸟类多尺度运动行为模式及其迁徙路线核心栖息地监测与保护研究. NSFC General Programme, 2023.01–2026.12, Principal investigator</w:t>
+      </w:r>
+    </w:p>
+    <w:p>
+      <w:pPr>
+        <w:pStyle w:val="ListBullet"/>
+      </w:pPr>
+      <w:r>
+        <w:t>基于多源遥感和卫星追踪大数据的鸟类运动行为信息反演研究. NSFC General Programme, 2019.01–2022.12, Principal investigator</w:t>
+      </w:r>
+    </w:p>
+    <w:p>
+      <w:r>
+        <w:rPr>
+          <w:b/>
+          <w:color w:val="0B1F33"/>
+          <w:sz w:val="26"/>
+        </w:rPr>
+        <w:t>Selected publications</w:t>
+      </w:r>
+    </w:p>
+    <w:p>
+      <w:pPr>
+        <w:pStyle w:val="ListBullet"/>
+      </w:pPr>
+      <w:r>
+        <w:t>Zhang, X., Wan, W., Yang, H. &amp; Yi, K. (2025). Rapid development of wind energy infrastructure threatens bird migration. The Innovation Geoscience 3(3): 100142. https://doi.org/10.59717/j.xinn-geo.2025.100142</w:t>
+      </w:r>
+    </w:p>
+    <w:p>
+      <w:pPr>
+        <w:pStyle w:val="ListBullet"/>
+      </w:pPr>
+      <w:r>
+        <w:t>Tian, Z., Huo, D., Yi, K., Que, J., Lu, Z. &amp; Hou, J. (2024). Evaluation of Suitable Habitats for Birds Based on MaxEnt and Google Earth Engine—A Case Study of Baer’s Pochard (Aythya baeri) in Baiyangdian, China. Remote Sensing 16(1): 64. https://doi.org/10.3390/rs16010064</w:t>
+      </w:r>
+    </w:p>
+    <w:p>
+      <w:pPr>
+        <w:pStyle w:val="ListBullet"/>
+      </w:pPr>
+      <w:r>
+        <w:t>Yi, K., Meng, F., Gu, D. &amp; Miao, Q. (2023). Optimizing Water Level Management Strategies to Strengthen Reservoir Support for Bird’s Migration Network. Remote Sensing 15(23): 5508. https://doi.org/10.3390/rs15235508</w:t>
+      </w:r>
+    </w:p>
+    <w:p>
+      <w:pPr>
+        <w:pStyle w:val="ListBullet"/>
+      </w:pPr>
+      <w:r>
+        <w:t>Yi, K., Zhang, J., Batbayar, N., Higuchi, H., Natsagdorj, T. &amp; Bysykatova, I. P. (2022). Using Tracking Data to Identify Gaps in Knowledge and Conservation of the Critically Endangered Siberian Crane (Leucogeranus leucogeranus). Remote Sensing 14(20): 5101. https://doi.org/10.3390/rs14205101</w:t>
+      </w:r>
+    </w:p>
+    <w:p>
+      <w:pPr>
+        <w:pStyle w:val="ListBullet"/>
+      </w:pPr>
+      <w:r>
+        <w:t>Batbayar, N., Yi, K., Zhang, J., Natsagdorj, T., Damba, I., Cao, L. &amp; Fox, A. D. (2021). Combining Tracking and Remote Sensing to Identify Critical Year-Round Site, Habitat Use and Migratory Connectivity of a Threatened Waterbird Species. Remote Sensing 13(20): 4049. https://doi.org/10.3390/rs13204049</w:t>
+      </w:r>
+    </w:p>
+    <w:p>
+      <w:r>
+        <w:rPr>
+          <w:b/>
+          <w:color w:val="0B1F33"/>
+          <w:sz w:val="26"/>
+        </w:rPr>
+        <w:t>Publications</w:t>
+      </w:r>
+    </w:p>
+    <w:p>
+      <w:pPr>
+        <w:pStyle w:val="ListBullet"/>
+      </w:pPr>
+      <w:r>
+        <w:t>Yu, M., Yin, L. &amp; Yi, K. (2026). Bird diversity responses to mega-events influence: A case study of the Beijing 2022 Winter Olympics. Ecological Informatics 93: 103594. https://doi.org/10.1016/j.ecoinf.2025.103594</w:t>
+      </w:r>
+    </w:p>
+    <w:p>
+      <w:pPr>
+        <w:pStyle w:val="ListBullet"/>
+      </w:pPr>
+      <w:r>
+        <w:t>Zhang, X., Wan, W., Yang, H. &amp; Yi, K. (2025). Rapid development of wind energy infrastructure threatens bird migration. The Innovation Geoscience 3(3): 100142. https://doi.org/10.59717/j.xinn-geo.2025.100142</w:t>
+      </w:r>
+    </w:p>
+    <w:p>
+      <w:pPr>
+        <w:pStyle w:val="ListBullet"/>
+      </w:pPr>
+      <w:r>
+        <w:t>Yin, S., Yi, K., Zhang, X., Nie, T., Meng, L., Sun, Z., Chu, Q., Ai, Z., Zhao, X., Wu, L., Guo, M. &amp; Liu, X. (2024). Temporal and Spatial Dynamics of Summer Crop Residue Burning Practices in North China. Remote Sensing 16(24): 4763. https://doi.org/10.3390/rs16244763</w:t>
+      </w:r>
+    </w:p>
+    <w:p>
+      <w:pPr>
+        <w:pStyle w:val="ListBullet"/>
+      </w:pPr>
+      <w:r>
+        <w:t>Tian, Z., Huo, D., Yi, K., Que, J., Lu, Z. &amp; Hou, J. (2024). Evaluation of Suitable Habitats for Birds Based on MaxEnt and Google Earth Engine—A Case Study of Baer’s Pochard (Aythya baeri) in Baiyangdian, China. Remote Sensing 16(1): 64. https://doi.org/10.3390/rs16010064</w:t>
+      </w:r>
+    </w:p>
+    <w:p>
+      <w:pPr>
+        <w:pStyle w:val="ListBullet"/>
+      </w:pPr>
+      <w:r>
+        <w:t>Yi, K., Meng, F., Gu, D. &amp; Miao, Q. (2023). Optimizing Water Level Management Strategies to Strengthen Reservoir Support for Bird’s Migration Network. Remote Sensing 15(23): 5508. https://doi.org/10.3390/rs15235508</w:t>
+      </w:r>
+    </w:p>
+    <w:p>
+      <w:pPr>
+        <w:pStyle w:val="ListBullet"/>
+      </w:pPr>
+      <w:r>
+        <w:t>Yi, K., Zhao, X., Zheng, Z., Zhao, D. &amp; Zeng, Y. (2023). Trends of greening and browning in terrestrial vegetation in China from 2000 to 2020. Ecological Indicators 154: 110587. https://doi.org/10.1016/j.ecolind.2023.110587</w:t>
+      </w:r>
+    </w:p>
+    <w:p>
+      <w:pPr>
+        <w:pStyle w:val="ListBullet"/>
+      </w:pPr>
+      <w:r>
+        <w:t>Yi, K., Zhang, J., Batbayar, N., Higuchi, H., Natsagdorj, T. &amp; Bysykatova, I. P. (2022). Using Tracking Data to Identify Gaps in Knowledge and Conservation of the Critically Endangered Siberian Crane (Leucogeranus leucogeranus). Remote Sensing 14(20): 5101. https://doi.org/10.3390/rs14205101</w:t>
+      </w:r>
+    </w:p>
+    <w:p>
+      <w:pPr>
+        <w:pStyle w:val="ListBullet"/>
+      </w:pPr>
+      <w:r>
+        <w:t>Bao, Y., Shinoda, M., Yi, K., et al. (2022). Satellite-Based Analysis of Spatiotemporal Wildfire Pattern in the Mongolian Plateau. Remote Sensing 15(1): 190. https://doi.org/10.3390/rs15010190</w:t>
+      </w:r>
+    </w:p>
+    <w:p>
+      <w:pPr>
+        <w:pStyle w:val="ListBullet"/>
+      </w:pPr>
+      <w:r>
+        <w:t>Ren, X., Yi, K. &amp; Cao, L. (2022). 优化风电场和电网布局以避免鸟撞. 环境保护科学 48(3): 13–19.</w:t>
+      </w:r>
+    </w:p>
+    <w:p>
+      <w:pPr>
+        <w:pStyle w:val="ListBullet"/>
+      </w:pPr>
+      <w:r>
+        <w:t>Batbayar, N., Yi, K., Zhang, J., Natsagdorj, T., Damba, I., Cao, L. &amp; Fox, A. D. (2021). Combining Tracking and Remote Sensing to Identify Critical Year-Round Site, Habitat Use and Migratory Connectivity of a Threatened Waterbird Species. Remote Sensing 13(20): 4049. https://doi.org/10.3390/rs13204049</w:t>
+      </w:r>
+    </w:p>
+    <w:p>
+      <w:pPr>
+        <w:pStyle w:val="ListBullet"/>
+      </w:pPr>
+      <w:r>
+        <w:t>Damba, I., Zhang, J., Yi, K., et al. (2021). Seasonal and regional differences in migration patterns and conservation status of Swan Geese (Anser cygnoides) in the East Asian Flyway. Avian Research 12(1): 73. https://doi.org/10.1186/s40657-021-00308-y</w:t>
+      </w:r>
+    </w:p>
+    <w:p>
+      <w:pPr>
+        <w:pStyle w:val="ListBullet"/>
+      </w:pPr>
+      <w:r>
+        <w:t>Li, H., Fang, L., Wang, X., Yi, K., Cao, L. &amp; Fox, A. D. (2020). Does snowmelt constrain spring migration progression in sympatric wintering Arctic-nesting geese? Ibis 162(2): 548–555. https://doi.org/10.1111/ibi.12767</w:t>
+      </w:r>
+    </w:p>
+    <w:p>
+      <w:pPr>
+        <w:pStyle w:val="ListBullet"/>
+      </w:pPr>
+      <w:r>
+        <w:t>Zhu, Q., Damba, I., Zhao, Q., Yi, K., et al. (2020). Lack of conspicuous sex-biased dispersal patterns at different spatial scales in an Asian endemic goose species breeding in unpredictable steppe wetlands. Ecology and Evolution 10: 7006–7020. https://doi.org/10.1002/ece3.6382</w:t>
+      </w:r>
+    </w:p>
+    <w:p>
+      <w:pPr>
+        <w:pStyle w:val="ListBullet"/>
+      </w:pPr>
+      <w:r>
+        <w:t>Damba, I., Fang, L., Yi, K., et al. (2020). Flyway structure, breeding, migration and wintering distributions of the globally threatened Swan Goose Anser cygnoides in East Asia. Wildfowl: 97–123.</w:t>
+      </w:r>
+    </w:p>
+    <w:p>
+      <w:pPr>
+        <w:pStyle w:val="ListBullet"/>
+      </w:pPr>
+      <w:r>
+        <w:t>Yan, M., Yi, K., Zhang, J., et al. (2020). Flyway connectivity and population status of the Greylag Goose Anser anser in East Asia. Wildfowl 6: 157–180.</w:t>
+      </w:r>
+    </w:p>
+    <w:p>
+      <w:pPr>
+        <w:pStyle w:val="ListBullet"/>
+      </w:pPr>
+      <w:r>
+        <w:t>Mao, D., Wang, Z., Wu, J., Wu, B., Zeng, Y., Song, K., Yi, K. &amp; Luo, L. (2018). China's wetlands loss to urban expansion. Land Degradation &amp; Development 29(8): 2644–2657. https://doi.org/10.1002/ldr.2939</w:t>
+      </w:r>
+    </w:p>
+    <w:p>
+      <w:pPr>
+        <w:pStyle w:val="ListBullet"/>
+      </w:pPr>
+      <w:r>
+        <w:t>Wang, X., Cao, L., Bysykatova, I., et al. (2018). The Far East taiga forest: unrecognized inhospitable terrain for migrating Arctic-nesting waterbirds? PeerJ 6: e4353. https://doi.org/10.7717/peerj.4353</w:t>
+      </w:r>
+    </w:p>
+    <w:p>
+      <w:pPr>
+        <w:pStyle w:val="ListBullet"/>
+      </w:pPr>
+      <w:r>
+        <w:t>Yi, K., Bao, Y. &amp; Zhang, J. (2017). Spatial distribution and temporal variability of open fire in China. International Journal of Wildland Fire 26(2): 122–135. https://doi.org/10.1071/WF15213</w:t>
+      </w:r>
+    </w:p>
+    <w:p>
+      <w:pPr>
+        <w:pStyle w:val="ListBullet"/>
+      </w:pPr>
+      <w:r>
+        <w:t>Yi, K., Zeng, Y. &amp; Wu, B. (2016). Mapping and evaluation the process, pattern and potential of urban growth in China. Applied Geography 71: 44–55. https://doi.org/10.1016/j.apgeog.2016.04.011</w:t>
+      </w:r>
+    </w:p>
+    <w:p>
+      <w:pPr>
+        <w:pStyle w:val="ListBullet"/>
+      </w:pPr>
+      <w:r>
+        <w:t>Yi, K. &amp; Bao, Y. (2016). Estimates of Wildfire Emissions in Boreal Forests of China. Forests 7(8): 158. https://doi.org/10.3390/f7080158</w:t>
+      </w:r>
+    </w:p>
+    <w:p>
+      <w:pPr>
+        <w:pStyle w:val="ListBullet"/>
+      </w:pPr>
+      <w:r>
+        <w:t>Yi, K., Tani, H., Li, Q., Zhang, J., Guo, M., Bao, Y., Wang, X. &amp; Li, J. (2014). Mapping and Evaluating the Urbanization Process in Northeast China Using DMSP/OLS Nighttime Light Data. Sensors 14(2): 3207–3226. https://doi.org/10.3390/s140203207</w:t>
+      </w:r>
+    </w:p>
+    <w:p>
+      <w:pPr>
+        <w:pStyle w:val="ListBullet"/>
+      </w:pPr>
+      <w:r>
+        <w:t>Yi, K., Tani, H., Zhang, J., Guo, M., Wang, X. &amp; Zhong, G. (2013). Long-Term Satellite Detection of Post-Fire Vegetation Trends in Boreal Forests of China. Remote Sensing 5(12): 6938–6957. https://doi.org/10.3390/rs5126938</w:t>
+      </w:r>
+    </w:p>
+    <w:p>
+      <w:pPr>
+        <w:pStyle w:val="ListBullet"/>
+      </w:pPr>
+      <w:r>
+        <w:t>Guo, M., Wang, X., Li, J., Yi, K., Zhong, G. &amp; Tani, H. (2012). Assessment of Global Carbon Dioxide Concentration Using MODIS and GOSAT Data. Sensors 12(12): 16368–16389. https://doi.org/10.3390/s121216368</w:t>
+      </w:r>
+    </w:p>
+    <w:p>
+      <w:r>
+        <w:rPr>
+          <w:b/>
+          <w:color w:val="0B1F33"/>
+          <w:sz w:val="26"/>
+        </w:rPr>
+        <w:t>Patents and books</w:t>
+      </w:r>
+    </w:p>
+    <w:p>
+      <w:r>
+        <w:t>Three invention patents. Two co-authored or edited books.</w:t>
       </w:r>
     </w:p>
     <w:p>
@@ -121,7 +388,7 @@
     </w:p>
     <w:p>
       <w:r>
-        <w:t>China Grassland Society (council member). Member of the Geographical Society of China, the Ecological Society of China, the Chinese Society of Remote Sensing, and the China Ornithological Society. Guest-in-chief editor of special issues for Remote Sensing, Land and Fire. The RCEES faculty-page awards section is empty.</w:t>
+        <w:t>Council member, China Grassland Society. Member of the Geographical Society of China, the Ecological Society of China, the Chinese Society of Remote Sensing, and the China Ornithological Society. Guest Editor of special issues for Remote Sensing, Land and Fire.</w:t>
       </w:r>
     </w:p>
     <w:p>
@@ -131,7 +398,7 @@
           <w:color w:val="0B1F33"/>
           <w:sz w:val="26"/>
         </w:rPr>
-        <w:t>Hosted NSFC projects (faculty page)</w:t>
+        <w:t>Students</w:t>
       </w:r>
     </w:p>
     <w:p>
@@ -139,7 +406,7 @@
         <w:pStyle w:val="ListBullet"/>
       </w:pPr>
       <w:r>
-        <w:t>鸟类多尺度运动行为模式及其迁徙路线核心栖息地监测与保护研究. NSFC General Programme, 2023.01–2026.12, 主持</w:t>
+        <w:t>Master’s supervisor (硕导).</w:t>
       </w:r>
     </w:p>
     <w:p>
@@ -147,37 +414,7 @@
         <w:pStyle w:val="ListBullet"/>
       </w:pPr>
       <w:r>
-        <w:t>基于多源遥感和卫星追踪大数据的鸟类运动行为信息反演研究. NSFC General Programme, 2019.01–2022.12, 主持</w:t>
-      </w:r>
-    </w:p>
-    <w:p>
-      <w:r>
-        <w:rPr>
-          <w:b/>
-          <w:color w:val="0B1F33"/>
-          <w:sz w:val="26"/>
-        </w:rPr>
-        <w:t>Projects and output (overview)</w:t>
-      </w:r>
-    </w:p>
-    <w:p>
-      <w:r>
-        <w:t>Has led more than ten research projects supported by the National Natural Science Foundation of China, a National Key R&amp;D Programme sub-project, and local commissions, with total hosted funding exceeding RMB 8 million. Has published more than 40 academic papers, holds three invention patents, and has contributed to two monographs. Project-level funding detail is kept in this CV and is not tabulated on the website.</w:t>
-      </w:r>
-    </w:p>
-    <w:p>
-      <w:r>
-        <w:rPr>
-          <w:b/>
-          <w:color w:val="0B1F33"/>
-          <w:sz w:val="26"/>
-        </w:rPr>
-        <w:t>Representative publications</w:t>
-      </w:r>
-    </w:p>
-    <w:p>
-      <w:r>
-        <w:t>Crossref-confirmed papers in which Kunpeng Yi is a named author. Citation counts are omitted.</w:t>
+        <w:t>Directions: 运动生态学，迁徙动物监测与保护; 湿地监测与生态修复; 生态系统遥感监测与评估.</w:t>
       </w:r>
     </w:p>
     <w:p>
@@ -185,7 +422,7 @@
         <w:pStyle w:val="ListBullet"/>
       </w:pPr>
       <w:r>
-        <w:t>Yu, M., Yin, L. &amp; Yi, K. (2026). Bird diversity responses to mega-events influence: A case study of the Beijing 2022 Winter Olympics. Ecological Informatics 93: 103594. doi:10.1016/j.ecoinf.2025.103594</w:t>
+        <w:t>Majors: 071300 Ecology; 0705Z1 Natural Resources Science; 070503 Cartography and Geographic Information Systems.</w:t>
       </w:r>
     </w:p>
     <w:p>
@@ -193,168 +430,7 @@
         <w:pStyle w:val="ListBullet"/>
       </w:pPr>
       <w:r>
-        <w:t>Zhang, X., Wan, W., Yang, H. &amp; Yi, K. (2025). Rapid development of wind energy infrastructure threatens bird migration. The Innovation Geoscience 3(3): 100142. doi:10.59717/j.xinn-geo.2025.100142</w:t>
-      </w:r>
-    </w:p>
-    <w:p>
-      <w:pPr>
-        <w:pStyle w:val="ListBullet"/>
-      </w:pPr>
-      <w:r>
-        <w:t>Yin, S., Yi, K., Zhang, X., Nie, T., Meng, L., Sun, Z., Chu, Q., Ai, Z., Zhao, X., Wu, L., Guo, M. &amp; Liu, X. (2024). Temporal and Spatial Dynamics of Summer Crop Residue Burning Practices in North China. Remote Sensing 16(24): 4763. doi:10.3390/rs16244763</w:t>
-      </w:r>
-    </w:p>
-    <w:p>
-      <w:pPr>
-        <w:pStyle w:val="ListBullet"/>
-      </w:pPr>
-      <w:r>
-        <w:t>Tian, Z., Huo, D., Yi, K., Que, J., Lu, Z. &amp; Hou, J. (2024). Evaluation of Suitable Habitats for Birds Based on MaxEnt and Google Earth Engine—A Case Study of Baer’s Pochard (Aythya baeri) in Baiyangdian, China. Remote Sensing 16(1): 64. doi:10.3390/rs16010064</w:t>
-      </w:r>
-    </w:p>
-    <w:p>
-      <w:pPr>
-        <w:pStyle w:val="ListBullet"/>
-      </w:pPr>
-      <w:r>
-        <w:t>Yi, K., Meng, F., Gu, D. &amp; Miao, Q. (2023). Optimizing Water Level Management Strategies to Strengthen Reservoir Support for Bird’s Migration Network. Remote Sensing 15(23): 5508. doi:10.3390/rs15235508</w:t>
-      </w:r>
-    </w:p>
-    <w:p>
-      <w:pPr>
-        <w:pStyle w:val="ListBullet"/>
-      </w:pPr>
-      <w:r>
-        <w:t>Yi, K., Zhao, X., Zheng, Z., Zhao, D. &amp; Zeng, Y. (2023). Trends of greening and browning in terrestrial vegetation in China from 2000 to 2020. Ecological Indicators 154: 110587. doi:10.1016/j.ecolind.2023.110587</w:t>
-      </w:r>
-    </w:p>
-    <w:p>
-      <w:pPr>
-        <w:pStyle w:val="ListBullet"/>
-      </w:pPr>
-      <w:r>
-        <w:t>Yi, K., Zhang, J., Batbayar, N., Higuchi, H., Natsagdorj, T. &amp; Bysykatova, I. P. (2022). Using Tracking Data to Identify Gaps in Knowledge and Conservation of the Critically Endangered Siberian Crane (Leucogeranus leucogeranus). Remote Sensing 14(20): 5101. doi:10.3390/rs14205101</w:t>
-      </w:r>
-    </w:p>
-    <w:p>
-      <w:pPr>
-        <w:pStyle w:val="ListBullet"/>
-      </w:pPr>
-      <w:r>
-        <w:t>Bao, Y., Shinoda, M., Yi, K., et al. (2022). Satellite-Based Analysis of Spatiotemporal Wildfire Pattern in the Mongolian Plateau. Remote Sensing 15(1): 190. doi:10.3390/rs15010190</w:t>
-      </w:r>
-    </w:p>
-    <w:p>
-      <w:pPr>
-        <w:pStyle w:val="ListBullet"/>
-      </w:pPr>
-      <w:r>
-        <w:t>Ren, X., Yi, K. &amp; Cao, L. (2022). 优化风电场和电网布局以避免鸟撞. 环境保护科学 48(3): 13–19. Listed on the official RCEES laboratory profile; no Crossref DOI verified.</w:t>
-      </w:r>
-    </w:p>
-    <w:p>
-      <w:pPr>
-        <w:pStyle w:val="ListBullet"/>
-      </w:pPr>
-      <w:r>
-        <w:t>Batbayar, N., Yi, K., Zhang, J., Natsagdorj, T., Damba, I., Cao, L. &amp; Fox, A. D. (2021). Combining Tracking and Remote Sensing to Identify Critical Year-Round Site, Habitat Use and Migratory Connectivity of a Threatened Waterbird Species. Remote Sensing 13(20): 4049. doi:10.3390/rs13204049</w:t>
-      </w:r>
-    </w:p>
-    <w:p>
-      <w:pPr>
-        <w:pStyle w:val="ListBullet"/>
-      </w:pPr>
-      <w:r>
-        <w:t>Damba, I., Zhang, J., Yi, K., et al. (2021). Seasonal and regional differences in migration patterns and conservation status of Swan Geese (Anser cygnoides) in the East Asian Flyway. Avian Research 12(1): 73. doi:10.1186/s40657-021-00308-y</w:t>
-      </w:r>
-    </w:p>
-    <w:p>
-      <w:pPr>
-        <w:pStyle w:val="ListBullet"/>
-      </w:pPr>
-      <w:r>
-        <w:t>Li, H., Fang, L., Wang, X., Yi, K., Cao, L. &amp; Fox, A. D. (2020). Does snowmelt constrain spring migration progression in sympatric wintering Arctic-nesting geese? Ibis 162(2): 548–555. doi:10.1111/ibi.12767</w:t>
-      </w:r>
-    </w:p>
-    <w:p>
-      <w:pPr>
-        <w:pStyle w:val="ListBullet"/>
-      </w:pPr>
-      <w:r>
-        <w:t>Zhu, Q., Damba, I., Zhao, Q., Yi, K., et al. (2020). Lack of conspicuous sex-biased dispersal patterns at different spatial scales in an Asian endemic goose species breeding in unpredictable steppe wetlands. Ecology and Evolution 10: 7006–7020. doi:10.1002/ece3.6382</w:t>
-      </w:r>
-    </w:p>
-    <w:p>
-      <w:pPr>
-        <w:pStyle w:val="ListBullet"/>
-      </w:pPr>
-      <w:r>
-        <w:t>Mao, D., Wang, Z., Wu, J., Wu, B., Zeng, Y., Song, K., Yi, K. &amp; Luo, L. (2018). China's wetlands loss to urban expansion. Land Degradation &amp; Development 29(8): 2644–2657. doi:10.1002/ldr.2939</w:t>
-      </w:r>
-    </w:p>
-    <w:p>
-      <w:pPr>
-        <w:pStyle w:val="ListBullet"/>
-      </w:pPr>
-      <w:r>
-        <w:t>Wang, X., Cao, L., Bysykatova, I., et al. (2018). The Far East taiga forest: unrecognized inhospitable terrain for migrating Arctic-nesting waterbirds? PeerJ 6: e4353. doi:10.7717/peerj.4353</w:t>
-      </w:r>
-    </w:p>
-    <w:p>
-      <w:pPr>
-        <w:pStyle w:val="ListBullet"/>
-      </w:pPr>
-      <w:r>
-        <w:t>Yi, K., Bao, Y. &amp; Zhang, J. (2017). Spatial distribution and temporal variability of open fire in China. International Journal of Wildland Fire 26(2): 122–135. doi:10.1071/WF15213</w:t>
-      </w:r>
-    </w:p>
-    <w:p>
-      <w:pPr>
-        <w:pStyle w:val="ListBullet"/>
-      </w:pPr>
-      <w:r>
-        <w:t>Yi, K., Zeng, Y. &amp; Wu, B. (2016). Mapping and evaluation the process, pattern and potential of urban growth in China. Applied Geography 71: 44–55. doi:10.1016/j.apgeog.2016.04.011</w:t>
-      </w:r>
-    </w:p>
-    <w:p>
-      <w:pPr>
-        <w:pStyle w:val="ListBullet"/>
-      </w:pPr>
-      <w:r>
-        <w:t>Yi, K. &amp; Bao, Y. (2016). Estimates of Wildfire Emissions in Boreal Forests of China. Forests 7(8): 158. doi:10.3390/f7080158</w:t>
-      </w:r>
-    </w:p>
-    <w:p>
-      <w:pPr>
-        <w:pStyle w:val="ListBullet"/>
-      </w:pPr>
-      <w:r>
-        <w:t>Yi, K., Tani, H., Li, Q., Zhang, J., Guo, M., Bao, Y., Wang, X. &amp; Li, J. (2014). Mapping and Evaluating the Urbanization Process in Northeast China Using DMSP/OLS Nighttime Light Data. Sensors 14(2): 3207–3226. doi:10.3390/s140203207</w:t>
-      </w:r>
-    </w:p>
-    <w:p>
-      <w:pPr>
-        <w:pStyle w:val="ListBullet"/>
-      </w:pPr>
-      <w:r>
-        <w:t>Yi, K., Tani, H., Zhang, J., Guo, M., Wang, X. &amp; Zhong, G. (2013). Long-Term Satellite Detection of Post-Fire Vegetation Trends in Boreal Forests of China. Remote Sensing 5(12): 6938–6957. doi:10.3390/rs5126938</w:t>
-      </w:r>
-    </w:p>
-    <w:p>
-      <w:pPr>
-        <w:pStyle w:val="ListBullet"/>
-      </w:pPr>
-      <w:r>
-        <w:t>Guo, M., Wang, X., Li, J., Yi, K., Zhong, G. &amp; Tani, H. (2012). Assessment of Global Carbon Dioxide Concentration Using MODIS and GOSAT Data. Sensors 12(12): 16368–16389. doi:10.3390/s121216368</w:t>
-      </w:r>
-    </w:p>
-    <w:p>
-      <w:r>
-        <w:rPr>
-          <w:i/>
-          <w:sz w:val="18"/>
-        </w:rPr>
-        <w:t>Reconstructed from the author-supplied English CV. Gender, place of birth, private telephone and home address are not included. Institutional email: kpyi@rcees.ac.cn.</w:t>
+        <w:t>Prospective students: write to kpyi@rcees.ac.cn.</w:t>
       </w:r>
     </w:p>
     <w:sectPr>

</xml_diff>

<commit_message>
Upgrade home from CV-style page to international PI entry
Fix English title and laboratory names, add signature programmes,
featured studies, a conceptual study-systems map, collaboration-access
data language, a projects page, and CI that runs check before build.

Co-authored-by: yikunpeng82-sys <yikunpeng82-sys@users.noreply.github.com>
</commit_message>
<xml_diff>
--- a/public/cv/kunpeng-yi-cv-en.docx
+++ b/public/cv/kunpeng-yi-cv-en.docx
@@ -13,12 +13,12 @@
     </w:p>
     <w:p>
       <w:r>
-        <w:t>Associate Professor, Research Center for Eco-Environmental Sciences, Chinese Academy of Sciences</w:t>
+        <w:t>Associate Researcher / Associate Professor, Research Center for Eco-Environmental Sciences, Chinese Academy of Sciences</w:t>
       </w:r>
     </w:p>
     <w:p>
       <w:r>
-        <w:t>State Key Laboratory of Regional and Urban Ecology (SKLRUE)</w:t>
+        <w:t>State Key Laboratory of Regional and Urban Ecology (SKLRUE), formerly State Key Laboratory of Urban and Regional Ecology</w:t>
       </w:r>
     </w:p>
     <w:p>
@@ -41,7 +41,7 @@
         <w:pStyle w:val="ListBullet"/>
       </w:pPr>
       <w:r>
-        <w:t>Associate Professor, Research Center for Eco-Environmental Sciences, Chinese Academy of Sciences; State Key Laboratory of Regional and Urban Ecology (SKLRUE), formerly State Key Laboratory of Urban and Regional Ecology — April 2017 – present</w:t>
+        <w:t>Associate Researcher / Associate Professor, Research Center for Eco-Environmental Sciences, Chinese Academy of Sciences; State Key Laboratory of Regional and Urban Ecology (SKLRUE), formerly State Key Laboratory of Urban and Regional Ecology — April 2017 – present</w:t>
       </w:r>
     </w:p>
     <w:p>

</xml_diff>